<commit_message>
SEQUOIADBMAINSTREAM-3749 【Story】SequoiaDB兼容Amazon S3接口 -支持分隔符可配置
git-svn-id: http://192.168.20.11/sequoiadb/trunk@40226 6121f079-4a18-41d3-8c30-8870a322f2c2
</commit_message>
<xml_diff>
--- a/internal_doc/03.开发设计/Amazon S3接口兼容/Story--SequoiaDB兼容Amazon S3接口 -区域管理.docx
+++ b/internal_doc/03.开发设计/Amazon S3接口兼容/Story--SequoiaDB兼容Amazon S3接口 -区域管理.docx
@@ -121,14 +121,12 @@
               </w:rPr>
               <w:t xml:space="preserve"> </w:t>
             </w:r>
-            <w:proofErr w:type="gramStart"/>
             <w:r>
               <w:rPr>
                 <w:rFonts w:hint="eastAsia"/>
               </w:rPr>
               <w:t>赵玉静</w:t>
             </w:r>
-            <w:proofErr w:type="gramEnd"/>
           </w:p>
         </w:tc>
         <w:tc>
@@ -1477,8 +1475,6 @@
         </w:rPr>
         <w:t>Region</w:t>
       </w:r>
-      <w:bookmarkStart w:id="0" w:name="_GoBack"/>
-      <w:bookmarkEnd w:id="0"/>
     </w:p>
     <w:p>
       <w:pPr>
@@ -1514,12 +1510,26 @@
         </w:rPr>
         <w:t>，只有</w:t>
       </w:r>
+      <w:commentRangeStart w:id="0"/>
+      <w:r>
+        <w:rPr>
+          <w:rFonts w:hint="eastAsia"/>
+        </w:rPr>
+        <w:t>管理员用户可以创</w:t>
+      </w:r>
       <w:commentRangeStart w:id="1"/>
       <w:r>
         <w:rPr>
           <w:rFonts w:hint="eastAsia"/>
         </w:rPr>
-        <w:t>管理员用户可以创建新的区域。</w:t>
+        <w:t>建新的区域。</w:t>
+      </w:r>
+      <w:commentRangeEnd w:id="0"/>
+      <w:r>
+        <w:rPr>
+          <w:rStyle w:val="af"/>
+        </w:rPr>
+        <w:commentReference w:id="0"/>
       </w:r>
       <w:commentRangeEnd w:id="1"/>
       <w:r>
@@ -1623,6 +1633,8 @@
         </w:rPr>
         <w:commentReference w:id="2"/>
       </w:r>
+      <w:bookmarkStart w:id="3" w:name="_GoBack"/>
+      <w:bookmarkEnd w:id="3"/>
     </w:p>
     <w:p>
       <w:pPr>
@@ -1834,9 +1846,6 @@
     <w:p>
       <w:pPr>
         <w:ind w:left="420"/>
-        <w:rPr>
-          <w:rFonts w:hint="eastAsia"/>
-        </w:rPr>
       </w:pPr>
     </w:p>
     <w:p>
@@ -1853,9 +1862,6 @@
     <w:p>
       <w:pPr>
         <w:ind w:left="0" w:firstLine="420"/>
-        <w:rPr>
-          <w:rFonts w:hint="eastAsia"/>
-        </w:rPr>
       </w:pPr>
       <w:r>
         <w:rPr>
@@ -1908,7 +1914,7 @@
         </w:rPr>
         <w:t>，</w:t>
       </w:r>
-      <w:commentRangeStart w:id="3"/>
+      <w:commentRangeStart w:id="4"/>
       <w:r>
         <w:rPr>
           <w:rFonts w:hint="eastAsia"/>
@@ -1933,12 +1939,12 @@
         </w:rPr>
         <w:t>，</w:t>
       </w:r>
-      <w:commentRangeEnd w:id="3"/>
+      <w:commentRangeEnd w:id="4"/>
       <w:r>
         <w:rPr>
           <w:rStyle w:val="af"/>
         </w:rPr>
-        <w:commentReference w:id="3"/>
+        <w:commentReference w:id="4"/>
       </w:r>
       <w:r>
         <w:rPr>
@@ -2576,7 +2582,7 @@
                 <w:rFonts w:cstheme="minorHAnsi"/>
               </w:rPr>
             </w:pPr>
-            <w:commentRangeStart w:id="4"/>
+            <w:commentRangeStart w:id="5"/>
             <w:r>
               <w:rPr>
                 <w:rFonts w:cstheme="minorHAnsi" w:hint="eastAsia"/>
@@ -2614,12 +2620,12 @@
               </w:rPr>
               <w:t>No</w:t>
             </w:r>
-            <w:commentRangeEnd w:id="4"/>
+            <w:commentRangeEnd w:id="5"/>
             <w:r>
               <w:rPr>
                 <w:rStyle w:val="af"/>
               </w:rPr>
-              <w:commentReference w:id="4"/>
+              <w:commentReference w:id="5"/>
             </w:r>
           </w:p>
         </w:tc>
@@ -2782,7 +2788,7 @@
               </w:rPr>
               <w:t>模式</w:t>
             </w:r>
-            <w:commentRangeStart w:id="5"/>
+            <w:commentRangeStart w:id="6"/>
             <w:r>
               <w:rPr>
                 <w:rFonts w:cstheme="minorHAnsi" w:hint="eastAsia"/>
@@ -2801,12 +2807,12 @@
               </w:rPr>
               <w:t>集</w:t>
             </w:r>
-            <w:commentRangeEnd w:id="5"/>
+            <w:commentRangeEnd w:id="6"/>
             <w:r>
               <w:rPr>
                 <w:rStyle w:val="af"/>
               </w:rPr>
-              <w:commentReference w:id="5"/>
+              <w:commentReference w:id="6"/>
             </w:r>
             <w:r>
               <w:rPr>
@@ -4367,8 +4373,8 @@
         <w:pStyle w:val="3"/>
         <w:ind w:left="210"/>
       </w:pPr>
-      <w:bookmarkStart w:id="6" w:name="_DELETE_Bucket"/>
-      <w:bookmarkEnd w:id="6"/>
+      <w:bookmarkStart w:id="7" w:name="_DELETE_Bucket"/>
+      <w:bookmarkEnd w:id="7"/>
       <w:r>
         <w:t xml:space="preserve">DELETE </w:t>
       </w:r>
@@ -4705,8 +4711,8 @@
       </w:tr>
     </w:tbl>
     <w:p>
-      <w:bookmarkStart w:id="7" w:name="_公共头部"/>
-      <w:bookmarkEnd w:id="7"/>
+      <w:bookmarkStart w:id="8" w:name="_公共头部"/>
+      <w:bookmarkEnd w:id="8"/>
     </w:p>
     <w:p>
       <w:pPr>
@@ -5069,7 +5075,7 @@
               </w:rPr>
               <w:t>，</w:t>
             </w:r>
-            <w:commentRangeStart w:id="8"/>
+            <w:commentRangeStart w:id="9"/>
             <w:r>
               <w:rPr>
                 <w:rFonts w:cstheme="minorHAnsi" w:hint="eastAsia"/>
@@ -5077,12 +5083,12 @@
               </w:rPr>
               <w:t>Buckets</w:t>
             </w:r>
-            <w:commentRangeEnd w:id="8"/>
+            <w:commentRangeEnd w:id="9"/>
             <w:r>
               <w:rPr>
                 <w:rStyle w:val="af"/>
               </w:rPr>
-              <w:commentReference w:id="8"/>
+              <w:commentReference w:id="9"/>
             </w:r>
           </w:p>
         </w:tc>
@@ -5099,7 +5105,7 @@
             <w:pPr>
               <w:ind w:left="0"/>
               <w:rPr>
-                <w:rFonts w:cstheme="minorHAnsi" w:hint="eastAsia"/>
+                <w:rFonts w:cstheme="minorHAnsi"/>
                 <w:color w:val="000000" w:themeColor="text1"/>
               </w:rPr>
             </w:pPr>
@@ -5136,7 +5142,7 @@
             <w:pPr>
               <w:ind w:left="0"/>
               <w:rPr>
-                <w:rFonts w:cstheme="minorHAnsi" w:hint="eastAsia"/>
+                <w:rFonts w:cstheme="minorHAnsi"/>
                 <w:color w:val="000000" w:themeColor="text1"/>
               </w:rPr>
             </w:pPr>
@@ -7957,13 +7963,13 @@
         <w:pStyle w:val="3"/>
         <w:ind w:left="210"/>
       </w:pPr>
-      <w:bookmarkStart w:id="9" w:name="_获取桶列表（GET_Service）"/>
-      <w:bookmarkStart w:id="10" w:name="_权限校验流程"/>
-      <w:bookmarkStart w:id="11" w:name="_创建用户（PUT_User）"/>
-      <w:bookmarkStart w:id="12" w:name="_Ref517361379"/>
-      <w:bookmarkEnd w:id="9"/>
+      <w:bookmarkStart w:id="10" w:name="_获取桶列表（GET_Service）"/>
+      <w:bookmarkStart w:id="11" w:name="_权限校验流程"/>
+      <w:bookmarkStart w:id="12" w:name="_创建用户（PUT_User）"/>
+      <w:bookmarkStart w:id="13" w:name="_Ref517361379"/>
       <w:bookmarkEnd w:id="10"/>
       <w:bookmarkEnd w:id="11"/>
+      <w:bookmarkEnd w:id="12"/>
       <w:r>
         <w:rPr>
           <w:rFonts w:hint="eastAsia"/>
@@ -8002,8 +8008,8 @@
       <w:pPr>
         <w:ind w:left="0"/>
       </w:pPr>
-      <w:bookmarkStart w:id="13" w:name="_创建桶（PUT_Bucket）"/>
-      <w:bookmarkEnd w:id="13"/>
+      <w:bookmarkStart w:id="14" w:name="_创建桶（PUT_Bucket）"/>
+      <w:bookmarkEnd w:id="14"/>
       <w:r>
         <w:rPr>
           <w:rFonts w:hint="eastAsia"/>
@@ -8186,12 +8192,14 @@
         </w:rPr>
         <w:t>区域名称在</w:t>
       </w:r>
+      <w:proofErr w:type="spellStart"/>
       <w:r>
         <w:rPr>
           <w:rFonts w:hint="eastAsia"/>
         </w:rPr>
         <w:t>RegionList</w:t>
       </w:r>
+      <w:proofErr w:type="spellEnd"/>
       <w:r>
         <w:rPr>
           <w:rFonts w:hint="eastAsia"/>
@@ -8318,19 +8326,19 @@
         </w:rPr>
         <w:t>，分</w:t>
       </w:r>
-      <w:commentRangeStart w:id="14"/>
+      <w:commentRangeStart w:id="15"/>
       <w:r>
         <w:rPr>
           <w:rFonts w:hint="eastAsia"/>
         </w:rPr>
         <w:t>别为区域内存储对象的集合空</w:t>
       </w:r>
-      <w:commentRangeEnd w:id="14"/>
+      <w:commentRangeEnd w:id="15"/>
       <w:r>
         <w:rPr>
           <w:rStyle w:val="af"/>
         </w:rPr>
-        <w:commentReference w:id="14"/>
+        <w:commentReference w:id="15"/>
       </w:r>
       <w:r>
         <w:rPr>
@@ -8892,34 +8900,64 @@
     </w:p>
     <w:p>
       <w:pPr>
-        <w:ind w:left="0"/>
-      </w:pPr>
-      <w:r>
-        <w:rPr>
-          <w:rFonts w:hint="eastAsia"/>
-        </w:rPr>
-        <w:t>创建区域</w:t>
-      </w:r>
-      <w:r>
-        <w:rPr>
-          <w:rFonts w:hint="eastAsia"/>
-        </w:rPr>
-        <w:t>时序图：</w:t>
+        <w:ind w:left="0" w:firstLineChars="200" w:firstLine="420"/>
+      </w:pPr>
+      <w:r>
+        <w:rPr>
+          <w:rFonts w:hint="eastAsia"/>
+        </w:rPr>
+        <w:t>对非指定模式配置的区域，在写入区域信息后，根据区域配置创建元数据集合空间，并创建元数据集合，历史元数据集合。</w:t>
       </w:r>
     </w:p>
     <w:p>
       <w:pPr>
+        <w:ind w:left="0" w:firstLineChars="200" w:firstLine="420"/>
+        <w:rPr>
+          <w:rFonts w:hint="eastAsia"/>
+        </w:rPr>
+      </w:pPr>
+      <w:r>
+        <w:rPr>
+          <w:rFonts w:hint="eastAsia"/>
+        </w:rPr>
+        <w:t>对所有区域，在创建（已有）元数据集合空间后，都要创建目录管理集合。</w:t>
+      </w:r>
+    </w:p>
+    <w:p>
+      <w:pPr>
+        <w:ind w:left="0" w:firstLineChars="200" w:firstLine="420"/>
+      </w:pPr>
+    </w:p>
+    <w:p>
+      <w:pPr>
         <w:ind w:left="0"/>
       </w:pPr>
       <w:r>
         <w:rPr>
+          <w:rFonts w:hint="eastAsia"/>
+        </w:rPr>
+        <w:t>创建区域</w:t>
+      </w:r>
+      <w:r>
+        <w:rPr>
+          <w:rFonts w:hint="eastAsia"/>
+        </w:rPr>
+        <w:t>时序图：</w:t>
+      </w:r>
+    </w:p>
+    <w:p>
+      <w:pPr>
+        <w:ind w:left="0"/>
+      </w:pPr>
+      <w:r>
+        <w:rPr>
           <w:noProof/>
         </w:rPr>
         <w:drawing>
-          <wp:inline distT="0" distB="0" distL="0" distR="0" wp14:anchorId="42C387EE" wp14:editId="62A94233">
-            <wp:extent cx="5274310" cy="3739375"/>
+          <wp:inline distT="0" distB="0" distL="0" distR="0" wp14:anchorId="3A48C06A" wp14:editId="1E2E1D72">
+            <wp:extent cx="5274310" cy="4238446"/>
             <wp:effectExtent l="0" t="0" r="2540" b="0"/>
-            <wp:docPr id="7" name="图片 7"/>
+            <wp:docPr id="1" name="图片 1"/>
             <wp:cNvGraphicFramePr>
               <a:graphicFrameLocks xmlns:a="http://schemas.openxmlformats.org/drawingml/2006/main" noChangeAspect="1"/>
             </wp:cNvGraphicFramePr>
@@ -8927,7 +8965,7 @@
               <a:graphicData uri="http://schemas.openxmlformats.org/drawingml/2006/picture">
                 <pic:pic xmlns:pic="http://schemas.openxmlformats.org/drawingml/2006/picture">
                   <pic:nvPicPr>
-                    <pic:cNvPr id="0" name="Picture 5"/>
+                    <pic:cNvPr id="0" name="Picture 1"/>
                     <pic:cNvPicPr>
                       <a:picLocks noChangeAspect="1" noChangeArrowheads="1"/>
                     </pic:cNvPicPr>
@@ -8948,7 +8986,7 @@
                   <pic:spPr bwMode="auto">
                     <a:xfrm>
                       <a:off x="0" y="0"/>
-                      <a:ext cx="5274310" cy="3739375"/>
+                      <a:ext cx="5274310" cy="4238446"/>
                     </a:xfrm>
                     <a:prstGeom prst="rect">
                       <a:avLst/>
@@ -9027,6 +9065,7 @@
         <w:rPr>
           <w:rFonts w:hint="eastAsia"/>
         </w:rPr>
+        <w:lastRenderedPageBreak/>
         <w:t>异常场景：</w:t>
       </w:r>
     </w:p>
@@ -9173,7 +9212,6 @@
         <w:rPr>
           <w:rFonts w:hint="eastAsia"/>
         </w:rPr>
-        <w:lastRenderedPageBreak/>
         <w:t>不允许修改配置类型，返回</w:t>
       </w:r>
       <w:proofErr w:type="spellStart"/>
@@ -9353,50 +9391,9 @@
         <w:rPr>
           <w:rFonts w:hint="eastAsia"/>
         </w:rPr>
-        <w:t>首先删除</w:t>
-      </w:r>
-      <w:r>
-        <w:rPr>
-          <w:rFonts w:hint="eastAsia"/>
-        </w:rPr>
-        <w:t>主</w:t>
-      </w:r>
-      <w:r>
-        <w:rPr>
-          <w:rFonts w:hint="eastAsia"/>
-        </w:rPr>
-        <w:t>元数据</w:t>
-      </w:r>
-      <w:r>
-        <w:rPr>
-          <w:rFonts w:hint="eastAsia"/>
-        </w:rPr>
-        <w:t>集合空间，然后删除</w:t>
-      </w:r>
-      <w:r>
-        <w:rPr>
-          <w:rFonts w:hint="eastAsia"/>
-        </w:rPr>
-        <w:t>子元数据集合空间和</w:t>
-      </w:r>
-      <w:r>
-        <w:rPr>
-          <w:rFonts w:hint="eastAsia"/>
-        </w:rPr>
-        <w:t>对象数据</w:t>
-      </w:r>
-      <w:r>
-        <w:rPr>
-          <w:rFonts w:hint="eastAsia"/>
-        </w:rPr>
-        <w:t>集合空间</w:t>
-      </w:r>
-      <w:r>
-        <w:rPr>
-          <w:rFonts w:hint="eastAsia"/>
-        </w:rPr>
-        <w:t>，需要先从</w:t>
-      </w:r>
+        <w:t>在</w:t>
+      </w:r>
+      <w:proofErr w:type="spellStart"/>
       <w:r>
         <w:rPr>
           <w:rFonts w:hint="eastAsia"/>
@@ -9415,6 +9412,7 @@
         </w:rPr>
         <w:t>List</w:t>
       </w:r>
+      <w:proofErr w:type="spellEnd"/>
       <w:r>
         <w:rPr>
           <w:rFonts w:hint="eastAsia"/>
@@ -9428,13 +9426,16 @@
         <w:t>Region</w:t>
       </w:r>
       <w:r>
-        <w:t>_</w:t>
-      </w:r>
-      <w:r>
-        <w:rPr>
-          <w:rFonts w:hint="eastAsia"/>
-        </w:rPr>
-        <w:t>为前缀查询获得该区域的对象数据集合空间列表，然后逐个</w:t>
+        <w:rPr>
+          <w:rFonts w:hint="eastAsia"/>
+        </w:rPr>
+        <w:t>名称查询该区域的</w:t>
+      </w:r>
+      <w:r>
+        <w:rPr>
+          <w:rFonts w:hint="eastAsia"/>
+        </w:rPr>
+        <w:t>集合空间列表，然后逐个</w:t>
       </w:r>
       <w:r>
         <w:rPr>
@@ -9446,13 +9447,39 @@
         <w:rPr>
           <w:rFonts w:hint="eastAsia"/>
         </w:rPr>
-        <w:t>。</w:t>
-      </w:r>
-      <w:r>
-        <w:rPr>
-          <w:rFonts w:hint="eastAsia"/>
-        </w:rPr>
-        <w:t xml:space="preserve"> </w:t>
+        <w:t>。删除完所有集合空间之后，将</w:t>
+      </w:r>
+      <w:proofErr w:type="spellStart"/>
+      <w:r>
+        <w:rPr>
+          <w:rFonts w:hint="eastAsia"/>
+        </w:rPr>
+        <w:t>RegionSpaceList</w:t>
+      </w:r>
+      <w:proofErr w:type="spellEnd"/>
+      <w:r>
+        <w:rPr>
+          <w:rFonts w:hint="eastAsia"/>
+        </w:rPr>
+        <w:t>表格中</w:t>
+      </w:r>
+      <w:r>
+        <w:rPr>
+          <w:rFonts w:hint="eastAsia"/>
+        </w:rPr>
+        <w:t>Region</w:t>
+      </w:r>
+      <w:r>
+        <w:rPr>
+          <w:rFonts w:hint="eastAsia"/>
+        </w:rPr>
+        <w:t>相关</w:t>
+      </w:r>
+      <w:r>
+        <w:rPr>
+          <w:rFonts w:hint="eastAsia"/>
+        </w:rPr>
+        <w:t>的记录删除。</w:t>
       </w:r>
     </w:p>
     <w:p>
@@ -9463,91 +9490,45 @@
         <w:rPr>
           <w:rFonts w:hint="eastAsia"/>
         </w:rPr>
-        <w:t>删除完所有集合空间之后，将</w:t>
-      </w:r>
-      <w:proofErr w:type="spellStart"/>
-      <w:r>
-        <w:rPr>
-          <w:rFonts w:hint="eastAsia"/>
-        </w:rPr>
-        <w:t>Region</w:t>
-      </w:r>
-      <w:r>
-        <w:rPr>
-          <w:rFonts w:hint="eastAsia"/>
-        </w:rPr>
-        <w:t>Space</w:t>
-      </w:r>
-      <w:proofErr w:type="spellEnd"/>
-      <w:r>
-        <w:rPr>
-          <w:rFonts w:hint="eastAsia"/>
-        </w:rPr>
-        <w:t>表格中具有</w:t>
-      </w:r>
-      <w:r>
-        <w:rPr>
-          <w:rFonts w:hint="eastAsia"/>
-        </w:rPr>
-        <w:t>Region</w:t>
-      </w:r>
-      <w:r>
-        <w:t>_</w:t>
-      </w:r>
-      <w:r>
-        <w:rPr>
-          <w:rFonts w:hint="eastAsia"/>
-        </w:rPr>
-        <w:t>前缀的记录删除。</w:t>
+        <w:t>再将区域信息从区域信息表中删除。</w:t>
       </w:r>
     </w:p>
     <w:p>
       <w:pPr>
         <w:ind w:left="0" w:firstLineChars="200" w:firstLine="420"/>
       </w:pPr>
-      <w:r>
-        <w:rPr>
-          <w:rFonts w:hint="eastAsia"/>
-        </w:rPr>
-        <w:t>再将区域信息从区域信息表中删除。</w:t>
-      </w:r>
     </w:p>
     <w:p>
       <w:pPr>
         <w:ind w:left="0" w:firstLineChars="200" w:firstLine="420"/>
       </w:pPr>
+      <w:r>
+        <w:rPr>
+          <w:rFonts w:hint="eastAsia"/>
+        </w:rPr>
+        <w:t>删除区域</w:t>
+      </w:r>
+      <w:r>
+        <w:rPr>
+          <w:rFonts w:hint="eastAsia"/>
+        </w:rPr>
+        <w:t>流程</w:t>
+      </w:r>
+      <w:r>
+        <w:rPr>
+          <w:rFonts w:hint="eastAsia"/>
+        </w:rPr>
+        <w:t>图如下</w:t>
+      </w:r>
+      <w:r>
+        <w:rPr>
+          <w:rFonts w:hint="eastAsia"/>
+        </w:rPr>
+        <w:t>：</w:t>
+      </w:r>
     </w:p>
     <w:p>
       <w:pPr>
-        <w:ind w:left="0" w:firstLineChars="200" w:firstLine="420"/>
-      </w:pPr>
-      <w:r>
-        <w:rPr>
-          <w:rFonts w:hint="eastAsia"/>
-        </w:rPr>
-        <w:t>删除区域</w:t>
-      </w:r>
-      <w:r>
-        <w:rPr>
-          <w:rFonts w:hint="eastAsia"/>
-        </w:rPr>
-        <w:t>流程</w:t>
-      </w:r>
-      <w:r>
-        <w:rPr>
-          <w:rFonts w:hint="eastAsia"/>
-        </w:rPr>
-        <w:t>图如下</w:t>
-      </w:r>
-      <w:r>
-        <w:rPr>
-          <w:rFonts w:hint="eastAsia"/>
-        </w:rPr>
-        <w:t>：</w:t>
-      </w:r>
-    </w:p>
-    <w:p>
-      <w:pPr>
         <w:ind w:left="0"/>
       </w:pPr>
       <w:r>
@@ -9556,10 +9537,10 @@
         </w:rPr>
         <w:lastRenderedPageBreak/>
         <w:drawing>
-          <wp:inline distT="0" distB="0" distL="0" distR="0" wp14:anchorId="1CC31AF7" wp14:editId="087FB067">
-            <wp:extent cx="4520565" cy="7475855"/>
-            <wp:effectExtent l="0" t="0" r="0" b="0"/>
-            <wp:docPr id="1" name="图片 1"/>
+          <wp:inline distT="0" distB="0" distL="0" distR="0" wp14:anchorId="7AEE69AB" wp14:editId="144039B9">
+            <wp:extent cx="4524375" cy="6828155"/>
+            <wp:effectExtent l="0" t="0" r="9525" b="0"/>
+            <wp:docPr id="3" name="图片 3"/>
             <wp:cNvGraphicFramePr>
               <a:graphicFrameLocks xmlns:a="http://schemas.openxmlformats.org/drawingml/2006/main" noChangeAspect="1"/>
             </wp:cNvGraphicFramePr>
@@ -9588,7 +9569,7 @@
                   <pic:spPr bwMode="auto">
                     <a:xfrm>
                       <a:off x="0" y="0"/>
-                      <a:ext cx="4520565" cy="7475855"/>
+                      <a:ext cx="4524375" cy="6828155"/>
                     </a:xfrm>
                     <a:prstGeom prst="rect">
                       <a:avLst/>
@@ -9670,7 +9651,6 @@
         <w:rPr>
           <w:rFonts w:hint="eastAsia"/>
         </w:rPr>
-        <w:lastRenderedPageBreak/>
         <w:t>区域</w:t>
       </w:r>
       <w:r>
@@ -9736,7 +9716,7 @@
         </w:rPr>
         <w:t>。</w:t>
       </w:r>
-      <w:bookmarkEnd w:id="12"/>
+      <w:bookmarkEnd w:id="13"/>
     </w:p>
     <w:p>
       <w:pPr>
@@ -9752,6 +9732,7 @@
         <w:rPr>
           <w:rFonts w:hint="eastAsia"/>
         </w:rPr>
+        <w:lastRenderedPageBreak/>
         <w:t>用户不是管理员身份，返回</w:t>
       </w:r>
       <w:proofErr w:type="spellStart"/>
@@ -9765,8 +9746,8 @@
         <w:pStyle w:val="3"/>
         <w:ind w:left="210"/>
       </w:pPr>
-      <w:bookmarkStart w:id="15" w:name="_获取版本控制配置（GET_Bucket_versioning）"/>
-      <w:bookmarkEnd w:id="15"/>
+      <w:bookmarkStart w:id="16" w:name="_获取版本控制配置（GET_Bucket_versioning）"/>
+      <w:bookmarkEnd w:id="16"/>
       <w:r>
         <w:rPr>
           <w:rFonts w:hint="eastAsia"/>
@@ -10090,7 +10071,6 @@
         <w:rPr>
           <w:rFonts w:hint="eastAsia"/>
         </w:rPr>
-        <w:lastRenderedPageBreak/>
         <w:t>获取区域是否存在流程：</w:t>
       </w:r>
     </w:p>
@@ -10102,6 +10082,7 @@
         <w:rPr>
           <w:noProof/>
         </w:rPr>
+        <w:lastRenderedPageBreak/>
         <w:drawing>
           <wp:inline distT="0" distB="0" distL="0" distR="0" wp14:anchorId="4F969285" wp14:editId="571EE985">
             <wp:extent cx="5274310" cy="3265049"/>
@@ -12131,7 +12112,7 @@
 
 <file path=word/comments.xml><?xml version="1.0" encoding="utf-8"?>
 <w:comments xmlns:wpc="http://schemas.microsoft.com/office/word/2010/wordprocessingCanvas" xmlns:cx="http://schemas.microsoft.com/office/drawing/2014/chartex" xmlns:mc="http://schemas.openxmlformats.org/markup-compatibility/2006" xmlns:o="urn:schemas-microsoft-com:office:office" xmlns:r="http://schemas.openxmlformats.org/officeDocument/2006/relationships" xmlns:m="http://schemas.openxmlformats.org/officeDocument/2006/math" xmlns:v="urn:schemas-microsoft-com:vml" xmlns:wp14="http://schemas.microsoft.com/office/word/2010/wordprocessingDrawing" xmlns:wp="http://schemas.openxmlformats.org/drawingml/2006/wordprocessingDrawing" xmlns:w10="urn:schemas-microsoft-com:office:word" xmlns:w="http://schemas.openxmlformats.org/wordprocessingml/2006/main" xmlns:w14="http://schemas.microsoft.com/office/word/2010/wordml" xmlns:w15="http://schemas.microsoft.com/office/word/2012/wordml" xmlns:w16se="http://schemas.microsoft.com/office/word/2015/wordml/symex" xmlns:wpg="http://schemas.microsoft.com/office/word/2010/wordprocessingGroup" xmlns:wpi="http://schemas.microsoft.com/office/word/2010/wordprocessingInk" xmlns:wne="http://schemas.microsoft.com/office/word/2006/wordml" xmlns:wps="http://schemas.microsoft.com/office/word/2010/wordprocessingShape" mc:Ignorable="w14 w15 w16se wp14">
-  <w:comment w:id="1" w:author="zhaoyujing" w:date="2019-01-08T15:15:00Z" w:initials="z">
+  <w:comment w:id="0" w:author="zhaoyujing" w:date="2019-01-08T15:15:00Z" w:initials="z">
     <w:p>
       <w:pPr>
         <w:pStyle w:val="af0"/>
@@ -12163,6 +12144,33 @@
           <w:rFonts w:hint="eastAsia"/>
         </w:rPr>
         <w:t>api</w:t>
+      </w:r>
+      <w:proofErr w:type="spellEnd"/>
+    </w:p>
+  </w:comment>
+  <w:comment w:id="1" w:author="zhaoyujing" w:date="2019-04-01T14:10:00Z" w:initials="z">
+    <w:p>
+      <w:pPr>
+        <w:pStyle w:val="af0"/>
+      </w:pPr>
+      <w:r>
+        <w:rPr>
+          <w:rStyle w:val="af"/>
+        </w:rPr>
+        <w:annotationRef/>
+      </w:r>
+      <w:r>
+        <w:rPr>
+          <w:rFonts w:hint="eastAsia"/>
+        </w:rPr>
+        <w:t>增加配置，可以配置</w:t>
+      </w:r>
+      <w:proofErr w:type="spellStart"/>
+      <w:r>
+        <w:rPr>
+          <w:rFonts w:hint="eastAsia"/>
+        </w:rPr>
+        <w:t>lobpagesize</w:t>
       </w:r>
       <w:proofErr w:type="spellEnd"/>
     </w:p>
@@ -12201,7 +12209,7 @@
       </w:r>
     </w:p>
   </w:comment>
-  <w:comment w:id="3" w:author="zhaoyujing" w:date="2019-01-08T15:14:00Z" w:initials="z">
+  <w:comment w:id="4" w:author="zhaoyujing" w:date="2019-01-08T15:14:00Z" w:initials="z">
     <w:p>
       <w:pPr>
         <w:pStyle w:val="af0"/>
@@ -12220,7 +12228,7 @@
       </w:r>
     </w:p>
   </w:comment>
-  <w:comment w:id="4" w:author="zhaoyujing" w:date="2018-12-21T15:35:00Z" w:initials="z">
+  <w:comment w:id="5" w:author="zhaoyujing" w:date="2018-12-21T15:35:00Z" w:initials="z">
     <w:p>
       <w:pPr>
         <w:pStyle w:val="af0"/>
@@ -12265,7 +12273,7 @@
       </w:r>
     </w:p>
   </w:comment>
-  <w:comment w:id="5" w:author="zhaoyujing" w:date="2019-01-08T14:40:00Z" w:initials="z">
+  <w:comment w:id="6" w:author="zhaoyujing" w:date="2019-01-08T14:40:00Z" w:initials="z">
     <w:p>
       <w:pPr>
         <w:pStyle w:val="af0"/>
@@ -12296,7 +12304,7 @@
       </w:r>
     </w:p>
   </w:comment>
-  <w:comment w:id="8" w:author="zhaoyujing" w:date="2019-01-08T15:40:00Z" w:initials="z">
+  <w:comment w:id="9" w:author="zhaoyujing" w:date="2019-01-08T15:40:00Z" w:initials="z">
     <w:p>
       <w:pPr>
         <w:pStyle w:val="af0"/>
@@ -12321,7 +12329,7 @@
       </w:r>
     </w:p>
   </w:comment>
-  <w:comment w:id="14" w:author="zhaoyujing" w:date="2019-01-08T14:49:00Z" w:initials="z">
+  <w:comment w:id="15" w:author="zhaoyujing" w:date="2019-01-08T14:49:00Z" w:initials="z">
     <w:p>
       <w:pPr>
         <w:pStyle w:val="af0"/>
@@ -12370,6 +12378,7 @@
 <file path=word/commentsExtended.xml><?xml version="1.0" encoding="utf-8"?>
 <w15:commentsEx xmlns:wpc="http://schemas.microsoft.com/office/word/2010/wordprocessingCanvas" xmlns:cx="http://schemas.microsoft.com/office/drawing/2014/chartex" xmlns:mc="http://schemas.openxmlformats.org/markup-compatibility/2006" xmlns:o="urn:schemas-microsoft-com:office:office" xmlns:r="http://schemas.openxmlformats.org/officeDocument/2006/relationships" xmlns:m="http://schemas.openxmlformats.org/officeDocument/2006/math" xmlns:v="urn:schemas-microsoft-com:vml" xmlns:wp14="http://schemas.microsoft.com/office/word/2010/wordprocessingDrawing" xmlns:wp="http://schemas.openxmlformats.org/drawingml/2006/wordprocessingDrawing" xmlns:w10="urn:schemas-microsoft-com:office:word" xmlns:w="http://schemas.openxmlformats.org/wordprocessingml/2006/main" xmlns:w14="http://schemas.microsoft.com/office/word/2010/wordml" xmlns:w15="http://schemas.microsoft.com/office/word/2012/wordml" xmlns:w16se="http://schemas.microsoft.com/office/word/2015/wordml/symex" xmlns:wpg="http://schemas.microsoft.com/office/word/2010/wordprocessingGroup" xmlns:wpi="http://schemas.microsoft.com/office/word/2010/wordprocessingInk" xmlns:wne="http://schemas.microsoft.com/office/word/2006/wordml" xmlns:wps="http://schemas.microsoft.com/office/word/2010/wordprocessingShape" mc:Ignorable="w14 w15 w16se wp14">
   <w15:commentEx w15:paraId="78B31BC4" w15:done="0"/>
+  <w15:commentEx w15:paraId="0F31DFBE" w15:done="0"/>
   <w15:commentEx w15:paraId="366FFCF8" w15:done="0"/>
   <w15:commentEx w15:paraId="6582469C" w15:done="0"/>
   <w15:commentEx w15:paraId="0111D668" w15:done="0"/>
@@ -12408,6 +12417,7 @@
         <w:docPartUnique/>
       </w:docPartObj>
     </w:sdtPr>
+    <w:sdtEndPr/>
     <w:sdtContent>
       <w:p>
         <w:pPr>
@@ -12428,7 +12438,7 @@
             <w:noProof/>
             <w:lang w:val="zh-CN"/>
           </w:rPr>
-          <w:t>14</w:t>
+          <w:t>13</w:t>
         </w:r>
         <w:r>
           <w:fldChar w:fldCharType="end"/>
@@ -18193,7 +18203,7 @@
 </file>
 
 <file path=customXml/itemProps1.xml><?xml version="1.0" encoding="utf-8"?>
-<ds:datastoreItem xmlns:ds="http://schemas.openxmlformats.org/officeDocument/2006/customXml" ds:itemID="{A9BDF4E7-3927-4D87-8C6B-2CC88B66DA2E}">
+<ds:datastoreItem xmlns:ds="http://schemas.openxmlformats.org/officeDocument/2006/customXml" ds:itemID="{DD400DFC-6814-47B2-A790-5BDBA622A69A}">
   <ds:schemaRefs>
     <ds:schemaRef ds:uri="http://schemas.openxmlformats.org/officeDocument/2006/bibliography"/>
   </ds:schemaRefs>

</xml_diff>